<commit_message>
Final gates in: Session38 stops at the 2 GiB file cap with the first 2 GiB identical; corpus clone restored; rebuild
Co-Authored-By: Claude Opus 5.5 <noreply@anthropic.com>
Claude-Session: https://claude.ai/code/session_014MWwL4Y634yj8JkXgcGvwh
</commit_message>
<xml_diff>
--- a/app/doc/out/swmm5-rust-doc.docx
+++ b/app/doc/out/swmm5-rust-doc.docx
@@ -2790,7 +2790,7 @@
           <w:sz w:val="22"/>
           <w:szCs w:val="22"/>
         </w:rPr>
-        <w:t xml:space="preserve">, the shape that taught us about the bit: 59 of 68 identical, 9 inconclusive (both runs hit the time cap), none different.</w:t>
+        <w:t xml:space="preserve">, the shape that taught us about the bit: 68 of 68 identical, none different.</w:t>
       </w:r>
     </w:p>
     <w:p>
@@ -2820,7 +2820,7 @@
           <w:sz w:val="22"/>
           <w:szCs w:val="22"/>
         </w:rPr>
-        <w:t xml:space="preserve"> that swmm5-cplus was gated on, 3,759 models from Bob's 1729-SWMM5-Models-2030 collection (every model under 125 KB and a seeded sample of larger ones): all 3,759 run, 3,738 identical, 15 undefined in C, 6 inconclusive at the time cap.</w:t>
+        <w:t xml:space="preserve"> that swmm5-cplus was gated on, 3,759 models from Bob's 1729-SWMM5-Models-2030 collection (every model under 125 KB and a seeded sample of larger ones): all 3,759 run, 3,742 identical, 15 undefined in C, 2 inconclusive at the time cap.</w:t>
       </w:r>
     </w:p>
     <w:p>
@@ -2835,7 +2835,58 @@
           <w:sz w:val="22"/>
           <w:szCs w:val="22"/>
         </w:rPr>
-        <w:t xml:space="preserve">Those three sets ran on the binary built before one last change to the engine. A control rule can read a link's velocity, and C works it out through a pointer to the link's own cross-section, the same pointer that lets FILLED_CIRCULAR edit that section by a bit. The Rust had used a read-only copy there, on an argument that the edit could not matter by then; an argument is not a test, so it now calls the function C calls. Built from the source as it stands, the engine went through the 221 smoke and coverage models again and every other gated model with control rules but the ten largest, 415 in all: all 415 run, 409 identical, 6 undefined in C, none different. The WebAssembly runs below are that build too.</w:t>
+        <w:t xml:space="preserve">Those three sets ran on the binary built before one last change to the engine. A control rule can read a link's velocity, and C works it out through a pointer to the link's own cross-section, the same pointer that lets FILLED_CIRCULAR edit that section by a bit. The Rust had used a read-only copy there, on an argument that the edit could not matter by then; an argument is not a test, so it now calls the function C calls. Built from the source as it stands, the engine went through the 221 smoke and coverage models again and every other gated model with control rules but the ten that had hit the time cap, 415 in all: all 415 run, 409 identical, 6 undefined in C, none different. The WebAssembly runs below are that build too.</w:t>
+      </w:r>
+    </w:p>
+    <w:p>
+      <w:pPr>
+        <w:keepNext w:val="false"/>
+        <w:spacing w:after="160" w:line="300"/>
+      </w:pPr>
+      <w:r>
+        <w:rPr>
+          <w:rFonts w:ascii="Georgia" w:cs="Georgia" w:eastAsia="Georgia" w:hAnsi="Georgia"/>
+          <w:color w:val="1B2733"/>
+          <w:sz w:val="22"/>
+          <w:szCs w:val="22"/>
+        </w:rPr>
+        <w:t xml:space="preserve">Some runs never got an answer. Two cores shared by several gates make every run slower, and the biggest models hit the five-minute cap in one engine or both. Those, the ten rule models among them, were run again with the engine as it stands, two at a time on a machine doing nothing else, with an hour each: 15 of the 16 finished inside the hour, 15 of them identical, none different. The last, </w:t>
+      </w:r>
+      <w:r>
+        <w:rPr>
+          <w:rFonts w:ascii="Consolas" w:cs="Consolas" w:eastAsia="Consolas" w:hAnsi="Consolas"/>
+          <w:color w:val="1B2733"/>
+          <w:sz w:val="19"/>
+          <w:szCs w:val="19"/>
+        </w:rPr>
+        <w:t xml:space="preserve">Session38_100_Control_Rules.inp</w:t>
+      </w:r>
+      <w:r>
+        <w:rPr>
+          <w:rFonts w:ascii="Georgia" w:cs="Georgia" w:eastAsia="Georgia" w:hAnsi="Georgia"/>
+          <w:color w:val="1B2733"/>
+          <w:sz w:val="22"/>
+          <w:szCs w:val="22"/>
+        </w:rPr>
+        <w:t xml:space="preserve">, kept EPA itself busy past the hour, so EPA and the Rust ran it side by side with no time cap. It reports every minute for eleven days, and both runs stopped where the gate stops any file, at 2 GiB, after 87 minutes for EPA and 100 for the Rust. Those first 2,147,483,648 bytes of the two </w:t>
+      </w:r>
+      <w:r>
+        <w:rPr>
+          <w:rFonts w:ascii="Consolas" w:cs="Consolas" w:eastAsia="Consolas" w:hAnsi="Consolas"/>
+          <w:color w:val="1B2733"/>
+          <w:sz w:val="19"/>
+          <w:szCs w:val="19"/>
+        </w:rPr>
+        <w:t xml:space="preserve">.out</w:t>
+      </w:r>
+      <w:r>
+        <w:rPr>
+          <w:rFonts w:ascii="Georgia" w:cs="Georgia" w:eastAsia="Georgia" w:hAnsi="Georgia"/>
+          <w:color w:val="1B2733"/>
+          <w:sz w:val="22"/>
+          <w:szCs w:val="22"/>
+        </w:rPr>
+        <w:t xml:space="preserve"> files are the same, byte for byte; the rest of the run, and the report written at its end, were never reached, so the model stays inconclusive.</w:t>
       </w:r>
     </w:p>
     <w:p>

</xml_diff>

<commit_message>
Fact-check corrections: inconclusive reasons, head-check counts, CRASH-07 (two of three decks agree), noise wording, malloc counts, 603 of 613 UHs
Co-Authored-By: Claude Opus 5.5 <noreply@anthropic.com>
Claude-Session: https://claude.ai/code/session_014MWwL4Y634yj8JkXgcGvwh
</commit_message>
<xml_diff>
--- a/app/doc/out/swmm5-rust-doc.docx
+++ b/app/doc/out/swmm5-rust-doc.docx
@@ -2674,7 +2674,7 @@
           <w:sz w:val="22"/>
           <w:szCs w:val="22"/>
         </w:rPr>
-        <w:t xml:space="preserve">Safe Rust gives the translator no way to copy an out-of-bounds read, so at each such place somebody had to choose. Mostly the choice was to stop. In one place it was not. SWMM's cross-section tables are read through a function that turns a ratio into an index with no check, and a NaN or a huge ratio sends C sixteen gigabytes below the table. The corpus has decks for it, CRASH-07 in the same review. Natively EPA dies; in WebAssembly it reads whatever is there and runs on. The Rust reads 0.0 and runs on too, because for a NaN ratio the answer is NaN whatever is read. On one of those decks all three WebAssembly engines then agree byte for byte; on the other, EPA's WebAssembly build read something different. Neither counts as a match. The defect register lists it as RS-10, choice and all.</w:t>
+        <w:t xml:space="preserve">Safe Rust gives the translator no way to copy an out-of-bounds read, so at each such place somebody had to choose. Mostly the choice was to stop. In one place it was not. SWMM's cross-section tables are read through a function that turns a ratio into an index with no check, and a NaN or a huge ratio sends C sixteen gigabytes below the table. The corpus has decks for it, CRASH-07 in the same review. Natively EPA dies; in WebAssembly it reads whatever is there and runs on. The Rust reads 0.0 and runs on too, because for a NaN ratio the answer is NaN whatever is read. On two of the three decks all three WebAssembly engines then agree byte for byte; on the third, EPA's WebAssembly build read something different. None of them counts as a match. The defect register lists it as RS-10, choice and all.</w:t>
       </w:r>
     </w:p>
     <w:p>
@@ -2820,7 +2820,7 @@
           <w:sz w:val="22"/>
           <w:szCs w:val="22"/>
         </w:rPr>
-        <w:t xml:space="preserve"> that swmm5-cplus was gated on, 3,759 models from Bob's 1729-SWMM5-Models-2030 collection (every model under 125 KB and a seeded sample of larger ones): all 3,759 run, 3,742 identical, 15 undefined in C, 2 inconclusive at the time cap.</w:t>
+        <w:t xml:space="preserve"> that swmm5-cplus was gated on, 3,759 models from Bob's 1729-SWMM5-Models-2030 collection (every model under 125 KB and a seeded sample of larger ones): all 3,759 run, 3,742 identical, 15 undefined in C, 2 inconclusive (the IO-02 deck, whose run would last 4.2e28 days; a control-rules model stopped at the 2 GiB file-size cap, below).</w:t>
       </w:r>
     </w:p>
     <w:p>
@@ -2835,7 +2835,7 @@
           <w:sz w:val="22"/>
           <w:szCs w:val="22"/>
         </w:rPr>
-        <w:t xml:space="preserve">Those three sets ran on the binary built before one last change to the engine. A control rule can read a link's velocity, and C works it out through a pointer to the link's own cross-section, the same pointer that lets FILLED_CIRCULAR edit that section by a bit. The Rust had used a read-only copy there, on an argument that the edit could not matter by then; an argument is not a test, so it now calls the function C calls. Built from the source as it stands, the engine went through the 221 smoke and coverage models again and every other gated model with control rules but the ten that had hit the time cap, 415 in all: all 415 run, 409 identical, 6 undefined in C, none different. The WebAssembly runs below are that build too.</w:t>
+        <w:t xml:space="preserve">Those three sets ran first on the binary built before one last change to the engine. A control rule can read a link's velocity, and C works it out through a pointer to the link's own cross-section, the same pointer that lets FILLED_CIRCULAR edit that section by a bit. The Rust had used a read-only copy there, on an argument that the edit could not matter by then; an argument is not a test, so it now calls the function C calls. Built from the source as it stands, the engine went through the 221 smoke and coverage models again and 194 other gated models with control rules, 415 in all: all 415 run, 409 identical, 6 undefined in C, none different. Ten slower rule models went to the long rerun below instead. The WebAssembly runs below are that build too.</w:t>
       </w:r>
     </w:p>
     <w:p>
@@ -2850,7 +2850,7 @@
           <w:sz w:val="22"/>
           <w:szCs w:val="22"/>
         </w:rPr>
-        <w:t xml:space="preserve">Some runs never got an answer. Two cores shared by several gates make every run slower, and the biggest models hit the five-minute cap in one engine or both. Those, the ten rule models among them, were run again with the engine as it stands, two at a time on a machine doing nothing else, with an hour each: 15 of the 16 finished inside the hour, 15 of them identical, none different. The last, </w:t>
+        <w:t xml:space="preserve">Some runs never got an answer. Two cores shared by several gates make every run slower, and the biggest models hit the five-minute cap in one engine or both. Those sixteen, among them the ten rule models held back from the check above, were run again with the engine as it stands, two at a time on a machine doing nothing else, with an hour each: 15 of the 16 finished inside the hour, 15 of them identical, none different. The last, </w:t>
       </w:r>
       <w:r>
         <w:rPr>
@@ -3254,7 +3254,7 @@
           <w:sz w:val="22"/>
           <w:szCs w:val="22"/>
         </w:rPr>
-        <w:t xml:space="preserve">Natively, over twelve models, swmm5-rust's median run time is 1.12 times EPA's, 12 percent longer. Model by model the ratio runs from 0.98 to 1.42; on ten of the twelve it is slower by more than EPA differs from itself on the same model; on two the difference is inside that noise. The noisiest model, </w:t>
+        <w:t xml:space="preserve">Natively, over twelve models, swmm5-rust's median run time is 1.12 times EPA's, 12 percent longer. Model by model the ratio runs from 0.98 to 1.42; on ten of the twelve its median is slower by more than EPA's own two medians differ on the same model; on two the difference is inside that noise. The noisiest model, </w:t>
       </w:r>
       <w:r>
         <w:rPr>
@@ -3272,7 +3272,7 @@
           <w:sz w:val="22"/>
           <w:szCs w:val="22"/>
         </w:rPr>
-        <w:t xml:space="preserve">, differs from itself by 12 percent between two runs of EPA, so a single ratio means little without its own floor. swmm5-cplus, built with link-time optimisation, comes in at a median of 0.94.</w:t>
+        <w:t xml:space="preserve">, has its two EPA medians 12 percent apart, and single runs scatter far more than medians do, so one ratio means little without its own floor. swmm5-cplus, built with link-time optimisation, comes in at a median of 0.94.</w:t>
       </w:r>
     </w:p>
     <w:p>
@@ -3287,7 +3287,7 @@
           <w:sz w:val="22"/>
           <w:szCs w:val="22"/>
         </w:rPr>
-        <w:t xml:space="preserve">In WebAssembly, run in node, swmm5-rust's median is 1.36 times EPA's, 36 percent longer, and swmm5-cplus's is 0.99; on all twelve it is slower by more than EPA differs from itself on the same model. The browser is a different machine, with its own compiler between the WebAssembly and the processor, so the two sets of ratios need not agree.</w:t>
+        <w:t xml:space="preserve">In WebAssembly, run in node, swmm5-rust's median is 1.36 times EPA's, 36 percent longer, and swmm5-cplus's is 0.99; on all twelve its median is slower by more than EPA's own two medians differ on the same model. The browser is a different machine, with its own compiler between the WebAssembly and the processor, so the two sets of ratios need not agree.</w:t>
       </w:r>
     </w:p>
     <w:p>
@@ -3334,7 +3334,7 @@
           <wp:inline distT="0" distB="0" distL="0" distR="0">
             <wp:extent cx="5943600" cy="3114675"/>
             <wp:effectExtent t="0" r="0" b="0" l="0"/>
-            <wp:docPr id="15" name="fig_profile.png" descr="Figure 15. Instruction counts for the ten busiest functions of one run. The same libm pow, sin, cos and sincos serve both engines and count the same, so they are left out." title="Figure 15"/>
+            <wp:docPr id="15" name="fig_profile.png" descr="Figure 15. Instruction counts for the ten busiest functions of one run. The same libm pow, sin, cos and sincos serve both engines and count within a few hundred instructions of each other, so they are left out." title="Figure 15"/>
             <wp:cNvGraphicFramePr>
               <a:graphicFrameLocks xmlns:a="http://schemas.openxmlformats.org/drawingml/2006/main" noChangeAspect="1"/>
             </wp:cNvGraphicFramePr>
@@ -3383,7 +3383,7 @@
           <w:sz w:val="18"/>
           <w:szCs w:val="18"/>
         </w:rPr>
-        <w:t xml:space="preserve">Figure 15. Instruction counts for the ten busiest functions of one run. The same libm pow, sin, cos and sincos serve both engines and count the same, so they are left out.</w:t>
+        <w:t xml:space="preserve">Figure 15. Instruction counts for the ten busiest functions of one run. The same libm pow, sin, cos and sincos serve both engines and count within a few hundred instructions of each other, so they are left out.</w:t>
       </w:r>
     </w:p>
     <w:p>
@@ -4151,7 +4151,7 @@
           <w:sz w:val="22"/>
           <w:szCs w:val="22"/>
         </w:rPr>
-        <w:t xml:space="preserve"> and its neighbours without asking whether they exist; the Rust checks each read, a comparison and a branch that is never taken, and returns 0.0 for a read outside the table where C would read whatever lay there (RS-10). Twenty-odd million calls make them count. (</w:t>
+        <w:t xml:space="preserve"> and its neighbours without asking whether they exist; the Rust checks each of those reads, a comparison and a branch that is never taken, and returns 0.0 for one outside the table where C would read whatever lay there (RS-10). Twenty-odd million calls make them count. (</w:t>
       </w:r>
       <w:r>
         <w:rPr>
@@ -4202,7 +4202,25 @@
           <w:sz w:val="22"/>
           <w:szCs w:val="22"/>
         </w:rPr>
-        <w:t xml:space="preserve">, a continuous simulation that reports often, that comes to 2,182,316 memory allocations against EPA's 6,834, 2,096,659 of them in the writer, and the writer, with everything it calls, costs 1.10 billion instructions against EPA's 780 million: 22 percent of the difference on that model. A buffer kept from one write to the next would remove most of it and write the same bytes, and the gate would be the judge of that.</w:t>
+        <w:t xml:space="preserve">, a continuous simulation that reports often, that comes to 2,182,316 calls to </w:t>
+      </w:r>
+      <w:r>
+        <w:rPr>
+          <w:rFonts w:ascii="Consolas" w:cs="Consolas" w:eastAsia="Consolas" w:hAnsi="Consolas"/>
+          <w:color w:val="1B2733"/>
+          <w:sz w:val="19"/>
+          <w:szCs w:val="19"/>
+        </w:rPr>
+        <w:t xml:space="preserve">malloc</w:t>
+      </w:r>
+      <w:r>
+        <w:rPr>
+          <w:rFonts w:ascii="Georgia" w:cs="Georgia" w:eastAsia="Georgia" w:hAnsi="Georgia"/>
+          <w:color w:val="1B2733"/>
+          <w:sz w:val="22"/>
+          <w:szCs w:val="22"/>
+        </w:rPr>
+        <w:t xml:space="preserve"> against EPA's 6,834, 2,096,659 of them from the writer, and the writer, with everything it calls, costs 1.10 billion instructions against EPA's 780 million: 22 percent of the difference on that model. A buffer kept from one write to the next would remove most of it and write the same bytes, and the gate would be the judge of that.</w:t>
       </w:r>
     </w:p>
     <w:p>

</xml_diff>